<commit_message>
uv stubs done for july
</commit_message>
<xml_diff>
--- a/flow/20230914_vu_template/drafts/2024-06-u/01-СБ-Юстина мч..docx
+++ b/flow/20230914_vu_template/drafts/2024-06-u/01-СБ-Юстина мч..docx
@@ -51,17 +51,19 @@
       </w:pPr>
       <w:r>
         <w:rPr>
-          <w:rFonts w:ascii="Times New Roman" w:hAnsi="Times New Roman"/>
+          <w:rFonts w:ascii="Times New Roman" w:hAnsi="Times New Roman" w:cs="Times New Roman"/>
           <w:i/>
           <w:color w:val="FF4400"/>
           <w:sz w:val="24"/>
+          <w:szCs w:val="24"/>
         </w:rPr>
         <w:t>Священик:</w:t>
       </w:r>
       <w:r>
         <w:rPr>
-          <w:rFonts w:ascii="Times New Roman" w:hAnsi="Times New Roman"/>
-          <w:sz w:val="24"/>
+          <w:rFonts w:ascii="Times New Roman" w:hAnsi="Times New Roman" w:cs="Times New Roman"/>
+          <w:sz w:val="24"/>
+          <w:szCs w:val="24"/>
         </w:rPr>
         <w:t xml:space="preserve"> Благословенний Бог наш завжди, нині і повсякчас, і на віки віків.</w:t>
       </w:r>
@@ -333,17 +335,19 @@
       </w:pPr>
       <w:r>
         <w:rPr>
-          <w:rFonts w:ascii="Times New Roman" w:hAnsi="Times New Roman"/>
+          <w:rFonts w:ascii="Times New Roman" w:hAnsi="Times New Roman" w:cs="Times New Roman"/>
           <w:i/>
           <w:color w:val="FF4400"/>
           <w:sz w:val="24"/>
+          <w:szCs w:val="24"/>
         </w:rPr>
         <w:t>Священик:</w:t>
       </w:r>
       <w:r>
         <w:rPr>
-          <w:rFonts w:ascii="Times New Roman" w:hAnsi="Times New Roman"/>
-          <w:sz w:val="24"/>
+          <w:rFonts w:ascii="Times New Roman" w:hAnsi="Times New Roman" w:cs="Times New Roman"/>
+          <w:sz w:val="24"/>
+          <w:szCs w:val="24"/>
         </w:rPr>
         <w:t xml:space="preserve"> Бо твоє є царство, і сила, і слава, Отця, і Сина, і Святого Духа, нині і повсякчас, і на віки віків.</w:t>
       </w:r>
@@ -2320,17 +2324,19 @@
       </w:pPr>
       <w:r>
         <w:rPr>
-          <w:rFonts w:ascii="Times New Roman" w:hAnsi="Times New Roman"/>
+          <w:rFonts w:ascii="Times New Roman" w:hAnsi="Times New Roman" w:cs="Times New Roman"/>
           <w:i/>
           <w:color w:val="FF4400"/>
           <w:sz w:val="24"/>
+          <w:szCs w:val="24"/>
         </w:rPr>
         <w:t>Священик:</w:t>
       </w:r>
       <w:r>
         <w:rPr>
-          <w:rFonts w:ascii="Times New Roman" w:hAnsi="Times New Roman"/>
-          <w:sz w:val="24"/>
+          <w:rFonts w:ascii="Times New Roman" w:hAnsi="Times New Roman" w:cs="Times New Roman"/>
+          <w:sz w:val="24"/>
+          <w:szCs w:val="24"/>
         </w:rPr>
         <w:t xml:space="preserve"> Бо тобі належить усяка слава, честь і поклоніння, Отцю, і Сину, і Святому Духові, нині і повсякчас, і на віки віків.</w:t>
       </w:r>
@@ -3204,75 +3210,49 @@
     </w:p>
     <w:p>
       <w:pPr>
-        <w:pStyle w:val="a"/>
-      </w:pPr>
-      <w:r>
-        <w:rPr>
-          <w:rFonts w:ascii="Times New Roman" w:hAnsi="Times New Roman"/>
-          <w:i/>
-          <w:color w:val="FF0000"/>
-          <w:sz w:val="24"/>
-        </w:rPr>
-        <w:t xml:space="preserve">(г. 4, подібний: Як хороброго): </w:t>
-      </w:r>
-      <w:r>
-        <w:rPr>
-          <w:rFonts w:ascii="Times New Roman" w:hAnsi="Times New Roman"/>
-          <w:sz w:val="24"/>
-        </w:rPr>
-        <w:t xml:space="preserve">Ти, </w:t>
-      </w:r>
-      <w:r>
-        <w:rPr>
-          <w:rFonts w:ascii="Times New Roman" w:hAnsi="Times New Roman"/>
-          <w:sz w:val="24"/>
-        </w:rPr>
-        <w:t>c</w:t>
-      </w:r>
-      <w:r>
-        <w:rPr>
-          <w:rFonts w:ascii="Times New Roman" w:hAnsi="Times New Roman"/>
-          <w:sz w:val="24"/>
-        </w:rPr>
-        <w:t xml:space="preserve">лавний, зодягнувся* у багряницю, обагрену кров'ю твого тіла,* тобто божественною благодаттю,* і голову свою ти прикрасив* вінком життя нетлінного.* Несучи в правиці, немов берло,* хресне переможне знамення,* всемудрий </w:t>
-      </w:r>
-      <w:r>
-        <w:rPr>
-          <w:rFonts w:ascii="Times New Roman" w:hAnsi="Times New Roman"/>
-          <w:sz w:val="24"/>
-        </w:rPr>
-        <w:t>м</w:t>
-      </w:r>
-      <w:r>
-        <w:rPr>
-          <w:rFonts w:ascii="Times New Roman" w:hAnsi="Times New Roman"/>
-          <w:sz w:val="24"/>
-        </w:rPr>
-        <w:t>ученику</w:t>
-      </w:r>
-      <w:r>
-        <w:rPr>
-          <w:rFonts w:ascii="Times New Roman" w:hAnsi="Times New Roman"/>
-          <w:sz w:val="24"/>
-        </w:rPr>
-        <w:t xml:space="preserve"> </w:t>
-      </w:r>
-      <w:r>
-        <w:rPr>
-          <w:rFonts w:ascii="Times New Roman" w:hAnsi="Times New Roman"/>
-          <w:i w:val="0"/>
-          <w:color w:val="000000"/>
-          <w:sz w:val="24"/>
-          <w:highlight w:val="yellow"/>
-        </w:rPr>
-        <w:t>Юстине</w:t>
-      </w:r>
-      <w:r>
-        <w:rPr>
-          <w:rFonts w:ascii="Times New Roman" w:hAnsi="Times New Roman"/>
-          <w:sz w:val="24"/>
-        </w:rPr>
-        <w:t>,* царюєш з Христом, постійно радіючи.</w:t>
+        <w:spacing w:before="280" w:after="120"/>
+        <w:jc w:val="both"/>
+        <w:rPr>
+          <w:rFonts w:ascii="Times New Roman" w:hAnsi="Times New Roman" w:cs="Times New Roman"/>
+          <w:sz w:val="24"/>
+          <w:szCs w:val="24"/>
+        </w:rPr>
+      </w:pPr>
+      <w:r>
+        <w:rPr>
+          <w:rFonts w:ascii="Times New Roman" w:hAnsi="Times New Roman" w:cs="Times New Roman"/>
+          <w:i/>
+          <w:color w:val="FF0000"/>
+          <w:sz w:val="24"/>
+          <w:szCs w:val="24"/>
+        </w:rPr>
+        <w:t>(г. 1, подібний: Преславні мученики):</w:t>
+      </w:r>
+      <w:r>
+        <w:rPr>
+          <w:rFonts w:ascii="Times New Roman" w:hAnsi="Times New Roman" w:cs="Times New Roman"/>
+          <w:sz w:val="24"/>
+          <w:szCs w:val="24"/>
+        </w:rPr>
+        <w:t xml:space="preserve"> Богомудрий, блаженний </w:t>
+      </w:r>
+      <w:r>
+        <w:rPr>
+          <w:rFonts w:ascii="Times New Roman" w:hAnsi="Times New Roman" w:cs="Times New Roman"/>
+          <w:i/>
+          <w:color w:val="FF0000"/>
+          <w:sz w:val="24"/>
+          <w:szCs w:val="24"/>
+        </w:rPr>
+        <w:t>Симеоне</w:t>
+      </w:r>
+      <w:r>
+        <w:rPr>
+          <w:rFonts w:ascii="Times New Roman" w:hAnsi="Times New Roman" w:cs="Times New Roman"/>
+          <w:sz w:val="24"/>
+          <w:szCs w:val="24"/>
+        </w:rPr>
+        <w:t>!* Багряною твоєю кров'ю* ти оздобив свою священну* і божественну одежу,* проходивши благочесно від сили до сили,* і від слави до слави.* Молися нині, щоб дано душам нашим мир* і велику милість.</w:t>
       </w:r>
     </w:p>
     <w:p>
@@ -3338,46 +3318,6 @@
     </w:p>
     <w:p>
       <w:pPr>
-        <w:pStyle w:val="a"/>
-      </w:pPr>
-      <w:r>
-        <w:rPr>
-          <w:rFonts w:ascii="Times New Roman" w:hAnsi="Times New Roman"/>
-          <w:sz w:val="24"/>
-        </w:rPr>
-        <w:t xml:space="preserve">Ти, </w:t>
-      </w:r>
-      <w:r>
-        <w:rPr>
-          <w:rFonts w:ascii="Times New Roman" w:hAnsi="Times New Roman"/>
-          <w:sz w:val="24"/>
-        </w:rPr>
-        <w:t>c</w:t>
-      </w:r>
-      <w:r>
-        <w:rPr>
-          <w:rFonts w:ascii="Times New Roman" w:hAnsi="Times New Roman"/>
-          <w:sz w:val="24"/>
-        </w:rPr>
-        <w:t xml:space="preserve">лавний, був знаний* як непереможний воїн.* Озброєний хресним знаряддям,* ти вийшов на боротьбу* з ворожою силою* і переміг її, </w:t>
-      </w:r>
-      <w:r>
-        <w:rPr>
-          <w:rFonts w:ascii="Times New Roman" w:hAnsi="Times New Roman"/>
-          <w:sz w:val="24"/>
-        </w:rPr>
-        <w:t>сл</w:t>
-      </w:r>
-      <w:r>
-        <w:rPr>
-          <w:rFonts w:ascii="Times New Roman" w:hAnsi="Times New Roman"/>
-          <w:sz w:val="24"/>
-        </w:rPr>
-        <w:t>авний, в бою* та й прийняв вінок перемоги* від єдиного Переможця і Владики,* що повсякчасно царює.</w:t>
-      </w:r>
-    </w:p>
-    <w:p>
-      <w:pPr>
         <w:spacing w:before="280" w:after="120"/>
         <w:jc w:val="both"/>
         <w:rPr>
@@ -3389,6 +3329,25 @@
       <w:r>
         <w:rPr>
           <w:rFonts w:ascii="Times New Roman" w:hAnsi="Times New Roman" w:cs="Times New Roman"/>
+          <w:sz w:val="24"/>
+          <w:szCs w:val="24"/>
+        </w:rPr>
+        <w:t>Як правдивий священик,* ти найперше приносив Богові* безкровну жертву,* наостанок же, як справжній мученик,* ти, всечесний благовіснику Бога,* приніс Христові себе самого,* як цілопальну приємну жертву.* Моли його за тих,* що тебе прославляють.</w:t>
+      </w:r>
+    </w:p>
+    <w:p>
+      <w:pPr>
+        <w:spacing w:before="280" w:after="120"/>
+        <w:jc w:val="both"/>
+        <w:rPr>
+          <w:rFonts w:ascii="Times New Roman" w:hAnsi="Times New Roman" w:cs="Times New Roman"/>
+          <w:sz w:val="24"/>
+          <w:szCs w:val="24"/>
+        </w:rPr>
+      </w:pPr>
+      <w:r>
+        <w:rPr>
+          <w:rFonts w:ascii="Times New Roman" w:hAnsi="Times New Roman" w:cs="Times New Roman"/>
           <w:i/>
           <w:color w:val="FF0000"/>
           <w:sz w:val="24"/>
@@ -3416,114 +3375,93 @@
     </w:p>
     <w:p>
       <w:pPr>
-        <w:pStyle w:val="a"/>
-      </w:pPr>
-      <w:r>
-        <w:rPr>
-          <w:rFonts w:ascii="Times New Roman" w:hAnsi="Times New Roman"/>
-          <w:sz w:val="24"/>
-        </w:rPr>
-        <w:t xml:space="preserve">Твоїми світлими стражданнями* ти, славний страждальнику </w:t>
-      </w:r>
-      <w:r>
-        <w:rPr>
-          <w:rFonts w:ascii="Times New Roman" w:hAnsi="Times New Roman"/>
-          <w:i w:val="0"/>
-          <w:color w:val="000000"/>
-          <w:sz w:val="24"/>
-          <w:highlight w:val="yellow"/>
-        </w:rPr>
-        <w:t>Юстине</w:t>
-      </w:r>
-      <w:r>
-        <w:rPr>
-          <w:rFonts w:ascii="Times New Roman" w:hAnsi="Times New Roman"/>
-          <w:sz w:val="24"/>
-        </w:rPr>
-        <w:t>* відобразив пречисті страждання* і явився переможцем* та й живеш, Страстотерпче, радіючи,* з усіма в небесній столиці,* обожений участю у Божому житті;* тому й ми звершуємо* твоє визначне і святе торжество.</w:t>
-      </w:r>
-    </w:p>
-    <w:p>
-      <w:pPr>
-        <w:pStyle w:val="a"/>
-      </w:pPr>
-      <w:r>
-        <w:rPr>
-          <w:rFonts w:ascii="Times New Roman" w:hAnsi="Times New Roman"/>
+        <w:spacing w:before="280" w:after="120"/>
+        <w:jc w:val="both"/>
+        <w:rPr>
+          <w:rFonts w:ascii="Times New Roman" w:hAnsi="Times New Roman" w:cs="Times New Roman"/>
+          <w:sz w:val="24"/>
+          <w:szCs w:val="24"/>
+        </w:rPr>
+      </w:pPr>
+      <w:r>
+        <w:rPr>
+          <w:rFonts w:ascii="Times New Roman" w:hAnsi="Times New Roman" w:cs="Times New Roman"/>
+          <w:sz w:val="24"/>
+          <w:szCs w:val="24"/>
+        </w:rPr>
+        <w:lastRenderedPageBreak/>
+        <w:t>Ти, богомудрий Отче, привів Христові мученицькі полки;* напоумляючи своїми повчаннями* і наказуючи заповідями,* ти поставив себе самого* за видимий зразок.* Молися з ними,* щоб дати душам нашим мир* і велику милість.</w:t>
+      </w:r>
+    </w:p>
+    <w:p>
+      <w:pPr>
+        <w:spacing w:after="120"/>
+        <w:jc w:val="both"/>
+        <w:rPr>
+          <w:rFonts w:ascii="Times New Roman" w:hAnsi="Times New Roman" w:cs="Times New Roman"/>
+          <w:i/>
+          <w:color w:val="FF0000"/>
+          <w:sz w:val="24"/>
+          <w:szCs w:val="24"/>
+        </w:rPr>
+      </w:pPr>
+    </w:p>
+    <w:p>
+      <w:pPr>
+        <w:spacing w:before="280" w:after="120"/>
+        <w:jc w:val="both"/>
+        <w:rPr>
+          <w:rFonts w:ascii="Times New Roman" w:hAnsi="Times New Roman" w:cs="Times New Roman"/>
+          <w:sz w:val="24"/>
+          <w:szCs w:val="24"/>
+        </w:rPr>
+      </w:pPr>
+      <w:r>
+        <w:rPr>
+          <w:rFonts w:ascii="Times New Roman" w:hAnsi="Times New Roman" w:cs="Times New Roman"/>
           <w:b/>
           <w:sz w:val="24"/>
-        </w:rPr>
-        <w:t xml:space="preserve">Слава </w:t>
-      </w:r>
-      <w:r>
-        <w:rPr>
-          <w:rFonts w:ascii="Times New Roman" w:hAnsi="Times New Roman"/>
-          <w:i/>
-          <w:color w:val="FF0000"/>
-          <w:sz w:val="24"/>
-        </w:rPr>
-        <w:t xml:space="preserve">(г. 6): </w:t>
-      </w:r>
-      <w:r>
-        <w:rPr>
-          <w:rFonts w:ascii="Times New Roman" w:hAnsi="Times New Roman"/>
-          <w:sz w:val="24"/>
-        </w:rPr>
-        <w:t xml:space="preserve">Нині вся вселенна просвічується промінням страстотерпця,* а Христова Церква, прикрашена квіттям, кличе до тебе, </w:t>
-      </w:r>
-      <w:r>
-        <w:rPr>
-          <w:rFonts w:ascii="Times New Roman" w:hAnsi="Times New Roman"/>
-          <w:i w:val="0"/>
-          <w:color w:val="000000"/>
-          <w:sz w:val="24"/>
-          <w:highlight w:val="yellow"/>
-        </w:rPr>
-        <w:t>Юстине</w:t>
-      </w:r>
-      <w:r>
-        <w:rPr>
-          <w:rFonts w:ascii="Times New Roman" w:hAnsi="Times New Roman"/>
-          <w:sz w:val="24"/>
-        </w:rPr>
-        <w:t>:* Угоднику Христовий і заступнику найщиріший,* не переставай молитися за нас до Господа.</w:t>
-      </w:r>
-    </w:p>
-    <w:p>
-      <w:pPr>
-        <w:spacing w:after="120"/>
-      </w:pPr>
-      <w:r>
-        <w:rPr>
-          <w:rFonts w:ascii="Times New Roman" w:hAnsi="Times New Roman"/>
-          <w:b/>
-          <w:sz w:val="24"/>
-        </w:rPr>
-        <w:t>І нині</w:t>
-      </w:r>
-      <w:r>
-        <w:rPr>
-          <w:rFonts w:ascii="Times New Roman" w:hAnsi="Times New Roman"/>
-          <w:sz w:val="24"/>
+          <w:szCs w:val="24"/>
+        </w:rPr>
+        <w:t>Слава і нині</w:t>
+      </w:r>
+      <w:r>
+        <w:rPr>
+          <w:rFonts w:ascii="Times New Roman" w:hAnsi="Times New Roman" w:cs="Times New Roman"/>
+          <w:sz w:val="24"/>
+          <w:szCs w:val="24"/>
         </w:rPr>
         <w:t xml:space="preserve"> </w:t>
       </w:r>
       <w:r>
         <w:rPr>
-          <w:rFonts w:ascii="Times New Roman" w:hAnsi="Times New Roman"/>
-          <w:i/>
-          <w:color w:val="FF0000"/>
-          <w:sz w:val="24"/>
+          <w:rFonts w:ascii="Times New Roman" w:hAnsi="Times New Roman" w:cs="Times New Roman"/>
+          <w:i/>
+          <w:color w:val="FF0000"/>
+          <w:sz w:val="24"/>
+          <w:szCs w:val="24"/>
         </w:rPr>
         <w:t>(догмат, г. 3):</w:t>
       </w:r>
       <w:r>
         <w:rPr>
-          <w:rFonts w:ascii="Times New Roman" w:hAnsi="Times New Roman"/>
-          <w:sz w:val="24"/>
+          <w:rFonts w:ascii="Times New Roman" w:hAnsi="Times New Roman" w:cs="Times New Roman"/>
+          <w:sz w:val="24"/>
+          <w:szCs w:val="24"/>
         </w:rPr>
         <w:t xml:space="preserve"> Як нам не дивуватися, Всечесна, твоєму богочоловічому родженню?* Бо ти, Всенепорочна, не знавши мужа,* породила тілесно без батька сина,* зродженого у вічності від Отця без матері,* що не зазнав ніякої зміни чи змішання, чи розділу,* але в цілості зберіг прикмети обох природ.* Тому Мати-Діво, Владичице, моли його,* щоб спас душі тих, що православно визнають тебе, як Богородицю.</w:t>
       </w:r>
+    </w:p>
+    <w:p>
+      <w:pPr>
+        <w:spacing w:after="120"/>
+        <w:jc w:val="both"/>
+        <w:rPr>
+          <w:rFonts w:ascii="Times New Roman" w:hAnsi="Times New Roman" w:cs="Times New Roman"/>
+          <w:sz w:val="24"/>
+          <w:szCs w:val="24"/>
+        </w:rPr>
+      </w:pPr>
     </w:p>
     <w:p>
       <w:pPr>
@@ -3640,17 +3578,19 @@
       </w:pPr>
       <w:r>
         <w:rPr>
-          <w:rFonts w:ascii="Times New Roman" w:hAnsi="Times New Roman"/>
+          <w:rFonts w:ascii="Times New Roman" w:hAnsi="Times New Roman" w:cs="Times New Roman"/>
           <w:i/>
           <w:color w:val="FF4400"/>
           <w:sz w:val="24"/>
+          <w:szCs w:val="24"/>
         </w:rPr>
         <w:t>Священик:</w:t>
       </w:r>
       <w:r>
         <w:rPr>
-          <w:rFonts w:ascii="Times New Roman" w:hAnsi="Times New Roman"/>
-          <w:sz w:val="24"/>
+          <w:rFonts w:ascii="Times New Roman" w:hAnsi="Times New Roman" w:cs="Times New Roman"/>
+          <w:sz w:val="24"/>
+          <w:szCs w:val="24"/>
         </w:rPr>
         <w:t xml:space="preserve"> Мир всім.</w:t>
       </w:r>
@@ -4574,17 +4514,19 @@
       </w:pPr>
       <w:r>
         <w:rPr>
-          <w:rFonts w:ascii="Times New Roman" w:hAnsi="Times New Roman"/>
+          <w:rFonts w:ascii="Times New Roman" w:hAnsi="Times New Roman" w:cs="Times New Roman"/>
           <w:i/>
           <w:color w:val="FF4400"/>
           <w:sz w:val="24"/>
+          <w:szCs w:val="24"/>
         </w:rPr>
         <w:t>Священик:</w:t>
       </w:r>
       <w:r>
         <w:rPr>
-          <w:rFonts w:ascii="Times New Roman" w:hAnsi="Times New Roman"/>
-          <w:sz w:val="24"/>
+          <w:rFonts w:ascii="Times New Roman" w:hAnsi="Times New Roman" w:cs="Times New Roman"/>
+          <w:sz w:val="24"/>
+          <w:szCs w:val="24"/>
         </w:rPr>
         <w:t xml:space="preserve"> Бо ти Бог милости, ласк і чоловіколюбности, і тобі славу віддаємо: Отцю, і Сину, і Святому Духові, нині і повсякчас, і на віки віків.</w:t>
       </w:r>
@@ -4639,17 +4581,19 @@
       </w:pPr>
       <w:r>
         <w:rPr>
-          <w:rFonts w:ascii="Times New Roman" w:hAnsi="Times New Roman"/>
+          <w:rFonts w:ascii="Times New Roman" w:hAnsi="Times New Roman" w:cs="Times New Roman"/>
           <w:i/>
           <w:color w:val="FF4400"/>
           <w:sz w:val="24"/>
+          <w:szCs w:val="24"/>
         </w:rPr>
         <w:t>Священик:</w:t>
       </w:r>
       <w:r>
         <w:rPr>
-          <w:rFonts w:ascii="Times New Roman" w:hAnsi="Times New Roman"/>
-          <w:sz w:val="24"/>
+          <w:rFonts w:ascii="Times New Roman" w:hAnsi="Times New Roman" w:cs="Times New Roman"/>
+          <w:sz w:val="24"/>
+          <w:szCs w:val="24"/>
         </w:rPr>
         <w:t xml:space="preserve"> Мир всім.</w:t>
       </w:r>
@@ -4808,17 +4752,19 @@
       </w:pPr>
       <w:r>
         <w:rPr>
-          <w:rFonts w:ascii="Times New Roman" w:hAnsi="Times New Roman"/>
+          <w:rFonts w:ascii="Times New Roman" w:hAnsi="Times New Roman" w:cs="Times New Roman"/>
           <w:i/>
           <w:color w:val="FF4400"/>
           <w:sz w:val="24"/>
+          <w:szCs w:val="24"/>
         </w:rPr>
         <w:t>Священик:</w:t>
       </w:r>
       <w:r>
         <w:rPr>
-          <w:rFonts w:ascii="Times New Roman" w:hAnsi="Times New Roman"/>
-          <w:sz w:val="24"/>
+          <w:rFonts w:ascii="Times New Roman" w:hAnsi="Times New Roman" w:cs="Times New Roman"/>
+          <w:sz w:val="24"/>
+          <w:szCs w:val="24"/>
         </w:rPr>
         <w:t xml:space="preserve"> Нехай буде влада царства твого благословенна і дуже прославлена: Отця, і Сина, і Святого Духа, нині і повсякчас, і на віки віків.</w:t>
       </w:r>
@@ -5380,17 +5326,19 @@
       </w:pPr>
       <w:r>
         <w:rPr>
-          <w:rFonts w:ascii="Times New Roman" w:hAnsi="Times New Roman"/>
+          <w:rFonts w:ascii="Times New Roman" w:hAnsi="Times New Roman" w:cs="Times New Roman"/>
           <w:i/>
           <w:color w:val="FF4400"/>
           <w:sz w:val="24"/>
+          <w:szCs w:val="24"/>
         </w:rPr>
         <w:t>Священик:</w:t>
       </w:r>
       <w:r>
         <w:rPr>
-          <w:rFonts w:ascii="Times New Roman" w:hAnsi="Times New Roman"/>
-          <w:sz w:val="24"/>
+          <w:rFonts w:ascii="Times New Roman" w:hAnsi="Times New Roman" w:cs="Times New Roman"/>
+          <w:sz w:val="24"/>
+          <w:szCs w:val="24"/>
         </w:rPr>
         <w:t xml:space="preserve"> Бо твоє є царство, і сила, і слава, Отця, і Сина, і Святого Духа, нині і повсякчас, і на віки віків.</w:t>
       </w:r>
@@ -5468,84 +5416,80 @@
     </w:p>
     <w:p>
       <w:pPr>
-        <w:pStyle w:val="a"/>
-        <w:spacing w:after="160"/>
-      </w:pPr>
-      <w:r>
-        <w:rPr>
-          <w:rFonts w:ascii="Times New Roman" w:hAnsi="Times New Roman"/>
-          <w:i/>
-          <w:color w:val="FF0000"/>
-          <w:sz w:val="24"/>
-        </w:rPr>
-        <w:t>Тропар (г. 4):</w:t>
-      </w:r>
-      <w:r>
-        <w:rPr>
-          <w:rFonts w:ascii="Times New Roman" w:hAnsi="Times New Roman"/>
-          <w:color w:val="000000"/>
-          <w:sz w:val="24"/>
-        </w:rPr>
-        <w:t xml:space="preserve"> Мученики Твої, Господи* у </w:t>
-      </w:r>
-      <w:r>
-        <w:rPr>
-          <w:rFonts w:ascii="Times New Roman" w:hAnsi="Times New Roman"/>
-          <w:sz w:val="24"/>
-        </w:rPr>
-        <w:t>стражданнях</w:t>
-      </w:r>
-      <w:r>
-        <w:rPr>
-          <w:rFonts w:ascii="Times New Roman" w:hAnsi="Times New Roman"/>
-          <w:color w:val="000000"/>
-          <w:sz w:val="24"/>
-        </w:rPr>
-        <w:t xml:space="preserve"> своїх прийняли вінець нетлінний від Тебе, Бога нашого,* мавши бо кріпость Твою, вони мучителів подолали,* сокрушили і демонів зухвальства безсильні.* Їх молитвами спаси душі наші.</w:t>
-      </w:r>
-    </w:p>
-    <w:p>
-      <w:pPr>
-        <w:pStyle w:val="Normal"/>
-      </w:pPr>
-      <w:r>
-        <w:rPr>
-          <w:rFonts w:ascii="Times New Roman" w:hAnsi="Times New Roman"/>
+        <w:rPr>
+          <w:rFonts w:ascii="Times New Roman" w:hAnsi="Times New Roman" w:cs="Times New Roman"/>
+          <w:i/>
+          <w:color w:val="FF0000"/>
+          <w:sz w:val="24"/>
+          <w:szCs w:val="24"/>
+        </w:rPr>
+      </w:pPr>
+      <w:r>
+        <w:rPr>
+          <w:rFonts w:ascii="Times New Roman" w:hAnsi="Times New Roman" w:cs="Times New Roman"/>
+          <w:i/>
+          <w:color w:val="FF0000"/>
+          <w:sz w:val="24"/>
+          <w:szCs w:val="24"/>
+        </w:rPr>
+        <w:t>(г. 1):</w:t>
+      </w:r>
+      <w:r>
+        <w:rPr>
+          <w:rFonts w:ascii="Times New Roman" w:hAnsi="Times New Roman" w:cs="Times New Roman"/>
+          <w:sz w:val="24"/>
+          <w:szCs w:val="24"/>
+        </w:rPr>
+        <w:t xml:space="preserve"> Як Христового родича, Симеоне священноначальнику,* і мученика твердого,* який оману погубив і віру зберіг,* священно восхваляємо тебе,* тому днесь священну пам’ять твою святкуючи,* приймаємо за молитвами твоїми прощення гріхів. </w:t>
+      </w:r>
+    </w:p>
+    <w:p>
+      <w:pPr>
+        <w:spacing w:before="280" w:after="120"/>
+        <w:jc w:val="both"/>
+        <w:rPr>
+          <w:rFonts w:ascii="Times New Roman" w:hAnsi="Times New Roman" w:cs="Times New Roman"/>
+          <w:sz w:val="24"/>
+          <w:szCs w:val="24"/>
+        </w:rPr>
+      </w:pPr>
+      <w:r>
+        <w:rPr>
+          <w:rFonts w:ascii="Times New Roman" w:hAnsi="Times New Roman" w:cs="Times New Roman"/>
           <w:b/>
           <w:sz w:val="24"/>
-        </w:rPr>
-        <w:t xml:space="preserve">І нині: </w:t>
-      </w:r>
-      <w:r>
-        <w:rPr>
-          <w:rFonts w:ascii="Times New Roman" w:hAnsi="Times New Roman"/>
-          <w:i/>
-          <w:color w:val="FF4400"/>
-          <w:sz w:val="24"/>
-        </w:rPr>
-        <w:t>Тропар (г. 8):</w:t>
-      </w:r>
-      <w:r>
-        <w:rPr>
-          <w:rFonts w:ascii="Times New Roman" w:hAnsi="Times New Roman"/>
-          <w:sz w:val="24"/>
+          <w:szCs w:val="24"/>
+        </w:rPr>
+        <w:t>Слава: і нині:</w:t>
+      </w:r>
+      <w:r>
+        <w:rPr>
+          <w:rFonts w:ascii="Times New Roman" w:hAnsi="Times New Roman" w:cs="Times New Roman"/>
+          <w:sz w:val="24"/>
+          <w:szCs w:val="24"/>
         </w:rPr>
         <w:t xml:space="preserve"> </w:t>
       </w:r>
       <w:r>
         <w:rPr>
-          <w:rFonts w:ascii="Times New Roman" w:hAnsi="Times New Roman"/>
-          <w:color w:val="333333"/>
-          <w:sz w:val="24"/>
-        </w:rPr>
-        <w:t>В переполовення празника спраглу душу мою благочестя напій водами,* до всіх бо, Спасе, закликав Ти:* Спраглий нехай гряде до мене і нехай п’є.* Джерело життя нашого, Христе Боже, слава Тобі.</w:t>
-      </w:r>
-    </w:p>
-    <w:p>
-      <w:pPr>
-        <w:pStyle w:val="Normal"/>
-      </w:pPr>
-    </w:p>
+          <w:rFonts w:ascii="Times New Roman" w:hAnsi="Times New Roman" w:cs="Times New Roman"/>
+          <w:i/>
+          <w:color w:val="FF0000"/>
+          <w:sz w:val="24"/>
+          <w:szCs w:val="24"/>
+        </w:rPr>
+        <w:t>(г. 8):</w:t>
+      </w:r>
+      <w:r>
+        <w:rPr>
+          <w:rFonts w:ascii="Times New Roman" w:hAnsi="Times New Roman" w:cs="Times New Roman"/>
+          <w:sz w:val="24"/>
+          <w:szCs w:val="24"/>
+        </w:rPr>
+        <w:t xml:space="preserve"> В переполовення празника спраглу душу мою благочестя напій водами, * до всіх бо, Спасе, закликав Ти: * Спраглий нехай гряде до мене і нехай п’є. * Джерело життя нашого, Христе Боже, слава Тобі.</w:t>
+      </w:r>
+    </w:p>
+    <w:p/>
     <w:p>
       <w:pPr>
         <w:pStyle w:val="Heading3"/>
@@ -5979,17 +5923,19 @@
       </w:pPr>
       <w:r>
         <w:rPr>
-          <w:rFonts w:ascii="Times New Roman" w:hAnsi="Times New Roman"/>
+          <w:rFonts w:ascii="Times New Roman" w:hAnsi="Times New Roman" w:cs="Times New Roman"/>
           <w:i/>
           <w:color w:val="FF4400"/>
           <w:sz w:val="24"/>
+          <w:szCs w:val="24"/>
         </w:rPr>
         <w:t>Священик:</w:t>
       </w:r>
       <w:r>
         <w:rPr>
-          <w:rFonts w:ascii="Times New Roman" w:hAnsi="Times New Roman"/>
-          <w:sz w:val="24"/>
+          <w:rFonts w:ascii="Times New Roman" w:hAnsi="Times New Roman" w:cs="Times New Roman"/>
+          <w:sz w:val="24"/>
+          <w:szCs w:val="24"/>
         </w:rPr>
         <w:t xml:space="preserve"> Бо милостивий і чоловіколюбець Бог єси, і тобі славу возсилаємо: Отцю, і Сину, і Святому Духові, нині і повсякчас, і на віки віків.</w:t>
       </w:r>
@@ -6125,19 +6071,22 @@
       </w:pPr>
       <w:r>
         <w:rPr>
-          <w:rFonts w:ascii="Times New Roman" w:hAnsi="Times New Roman"/>
+          <w:rFonts w:ascii="Times New Roman" w:hAnsi="Times New Roman" w:cs="Times New Roman"/>
           <w:i/>
           <w:color w:val="FF4400"/>
           <w:sz w:val="24"/>
-        </w:rPr>
+          <w:szCs w:val="24"/>
+        </w:rPr>
+        <w:lastRenderedPageBreak/>
         <w:t>Священик:</w:t>
       </w:r>
       <w:r>
         <w:rPr>
-          <w:rFonts w:ascii="Times New Roman" w:hAnsi="Times New Roman"/>
-          <w:sz w:val="24"/>
-        </w:rPr>
-        <w:t xml:space="preserve"> Слава тобі, Христе Боже, надіє наша, слава тобі!</w:t>
+          <w:rFonts w:ascii="Times New Roman" w:hAnsi="Times New Roman" w:cs="Times New Roman"/>
+          <w:sz w:val="24"/>
+          <w:szCs w:val="24"/>
+        </w:rPr>
+        <w:t> Слава тобі, Христе Боже, надіє наша, слава тобі!</w:t>
       </w:r>
     </w:p>
     <w:p>
@@ -6191,37 +6140,59 @@
       </w:r>
     </w:p>
     <w:p>
-      <w:r>
-        <w:rPr>
-          <w:rFonts w:ascii="Times New Roman" w:hAnsi="Times New Roman"/>
-          <w:i/>
-          <w:color w:val="FF4400"/>
-          <w:sz w:val="24"/>
+      <w:pPr>
+        <w:spacing w:before="280" w:after="120"/>
+        <w:jc w:val="both"/>
+        <w:rPr>
+          <w:rFonts w:ascii="Times New Roman" w:hAnsi="Times New Roman" w:cs="Times New Roman"/>
+          <w:sz w:val="24"/>
+          <w:szCs w:val="24"/>
+        </w:rPr>
+      </w:pPr>
+      <w:r>
+        <w:rPr>
+          <w:rFonts w:ascii="Times New Roman" w:hAnsi="Times New Roman" w:cs="Times New Roman"/>
+          <w:i/>
+          <w:color w:val="FF0000"/>
+          <w:sz w:val="24"/>
+          <w:szCs w:val="24"/>
         </w:rPr>
         <w:t>Священик:</w:t>
       </w:r>
       <w:r>
         <w:rPr>
-          <w:rFonts w:ascii="Times New Roman" w:hAnsi="Times New Roman"/>
-          <w:sz w:val="24"/>
-        </w:rPr>
-        <w:t xml:space="preserve"> Христос, істинний Бог наш - молитвами пречистої Своєї Матері, силою чесного і животворчого Хреста, заступництвом чесних небесних сил безтілесних, чесного і славного пророка, предтечі і хрестителя Йоана, святих славних і всехвальних апостолів, святого отця нашого Миколая, архиєпископа Мир Ликійських, чудотворця, святих славних і переможних мучеників, преподобних і богоносних отців наших, святих і праведних богоотців Йоакима й Анни, святого, </w:t>
-      </w:r>
-      <w:r>
-        <w:rPr>
-          <w:rFonts w:ascii="Times New Roman" w:hAnsi="Times New Roman"/>
-          <w:i/>
-          <w:color w:val="FF4400"/>
-          <w:sz w:val="24"/>
-        </w:rPr>
-        <w:t>якого є храм</w:t>
-      </w:r>
-      <w:r>
-        <w:rPr>
-          <w:rFonts w:ascii="Times New Roman" w:hAnsi="Times New Roman"/>
-          <w:sz w:val="24"/>
-        </w:rPr>
-        <w:t>, святого мученика Юстина, філософа, і тих, що з ним і всіх святих - помилує і спасе нас як благий і людинолюбний.</w:t>
+          <w:rFonts w:ascii="Times New Roman" w:hAnsi="Times New Roman" w:cs="Times New Roman"/>
+          <w:color w:val="FF0000"/>
+          <w:sz w:val="24"/>
+          <w:szCs w:val="24"/>
+        </w:rPr>
+        <w:t xml:space="preserve"> </w:t>
+      </w:r>
+      <w:r>
+        <w:rPr>
+          <w:rFonts w:ascii="Times New Roman" w:hAnsi="Times New Roman" w:cs="Times New Roman"/>
+          <w:sz w:val="24"/>
+          <w:szCs w:val="24"/>
+        </w:rPr>
+        <w:t xml:space="preserve">Христос, що воскрес із мертвих, істинний Бог наш, молитвами пречистої своєї Матері, святих, славних і всехвальних апостолів. і святого </w:t>
+      </w:r>
+      <w:r>
+        <w:rPr>
+          <w:rFonts w:ascii="Times New Roman" w:hAnsi="Times New Roman" w:cs="Times New Roman"/>
+          <w:i/>
+          <w:color w:val="FF0000"/>
+          <w:sz w:val="24"/>
+          <w:szCs w:val="24"/>
+        </w:rPr>
+        <w:t>(ім'я, якого є храм)</w:t>
+      </w:r>
+      <w:r>
+        <w:rPr>
+          <w:rFonts w:ascii="Times New Roman" w:hAnsi="Times New Roman" w:cs="Times New Roman"/>
+          <w:sz w:val="24"/>
+          <w:szCs w:val="24"/>
+        </w:rPr>
+        <w:t>, святого священномученика Симеона, родича Господнього, преподобного Стефана, єпископа Володимира Волинського, і всіх святих, помилує і спасе нас, як благий і чоловіколюбець.</w:t>
       </w:r>
     </w:p>
     <w:p>
@@ -6430,17 +6401,19 @@
       </w:pPr>
       <w:r>
         <w:rPr>
-          <w:rFonts w:ascii="Times New Roman" w:hAnsi="Times New Roman"/>
+          <w:rFonts w:ascii="Times New Roman" w:hAnsi="Times New Roman" w:cs="Times New Roman"/>
           <w:i/>
           <w:color w:val="FF4400"/>
           <w:sz w:val="24"/>
+          <w:szCs w:val="24"/>
         </w:rPr>
         <w:t>Священик:</w:t>
       </w:r>
       <w:r>
         <w:rPr>
-          <w:rFonts w:ascii="Times New Roman" w:hAnsi="Times New Roman"/>
-          <w:sz w:val="24"/>
+          <w:rFonts w:ascii="Times New Roman" w:hAnsi="Times New Roman" w:cs="Times New Roman"/>
+          <w:sz w:val="24"/>
+          <w:szCs w:val="24"/>
         </w:rPr>
         <w:t xml:space="preserve"> Слава святій, одноістотній, животворящій і нероздільній Тройці, завжди, нині і повсякчас, і на віки віків.</w:t>
       </w:r>
@@ -9957,17 +9930,19 @@
       </w:pPr>
       <w:r>
         <w:rPr>
-          <w:rFonts w:ascii="Times New Roman" w:hAnsi="Times New Roman"/>
+          <w:rFonts w:ascii="Times New Roman" w:hAnsi="Times New Roman" w:cs="Times New Roman"/>
           <w:i/>
           <w:color w:val="FF4400"/>
           <w:sz w:val="24"/>
+          <w:szCs w:val="24"/>
         </w:rPr>
         <w:t>Священик:</w:t>
       </w:r>
       <w:r>
         <w:rPr>
-          <w:rFonts w:ascii="Times New Roman" w:hAnsi="Times New Roman"/>
-          <w:sz w:val="24"/>
+          <w:rFonts w:ascii="Times New Roman" w:hAnsi="Times New Roman" w:cs="Times New Roman"/>
+          <w:sz w:val="24"/>
+          <w:szCs w:val="24"/>
         </w:rPr>
         <w:t xml:space="preserve"> Бо тобі належить усяка слава, честь і поклоніння, Отцю, і Сину, і Святому Духові, нині і повсякчас, і на віки віків.</w:t>
       </w:r>
@@ -10270,91 +10245,141 @@
     </w:p>
     <w:p>
       <w:pPr>
-        <w:pStyle w:val="a"/>
-        <w:spacing w:after="160"/>
-      </w:pPr>
-      <w:r>
-        <w:rPr>
-          <w:rFonts w:ascii="Times New Roman" w:hAnsi="Times New Roman"/>
-          <w:i/>
-          <w:color w:val="FF0000"/>
-          <w:sz w:val="24"/>
-        </w:rPr>
-        <w:t>Тропар (г. 4):</w:t>
-      </w:r>
-      <w:r>
-        <w:rPr>
-          <w:rFonts w:ascii="Times New Roman" w:hAnsi="Times New Roman"/>
-          <w:color w:val="000000"/>
-          <w:sz w:val="24"/>
-        </w:rPr>
-        <w:t xml:space="preserve"> Мученики Твої, Господи* у </w:t>
-      </w:r>
-      <w:r>
-        <w:rPr>
-          <w:rFonts w:ascii="Times New Roman" w:hAnsi="Times New Roman"/>
-          <w:sz w:val="24"/>
-        </w:rPr>
-        <w:t>стражданнях</w:t>
-      </w:r>
-      <w:r>
-        <w:rPr>
-          <w:rFonts w:ascii="Times New Roman" w:hAnsi="Times New Roman"/>
-          <w:color w:val="000000"/>
-          <w:sz w:val="24"/>
-        </w:rPr>
-        <w:t xml:space="preserve"> своїх прийняли вінець нетлінний від Тебе, Бога нашого,* мавши бо кріпость Твою, вони мучителів подолали,* сокрушили і демонів зухвальства безсильні.* Їх молитвами спаси душі наші.</w:t>
-      </w:r>
-      <w:r>
-        <w:rPr>
-          <w:rFonts w:ascii="Times New Roman" w:hAnsi="Times New Roman"/>
-          <w:i/>
-          <w:color w:val="FF4400"/>
-          <w:sz w:val="24"/>
-        </w:rPr>
-        <w:t xml:space="preserve"> (2 р.)</w:t>
-      </w:r>
-    </w:p>
-    <w:p>
-      <w:pPr>
-        <w:pStyle w:val="Normal"/>
-      </w:pPr>
-      <w:r>
-        <w:rPr>
-          <w:rFonts w:ascii="Times New Roman" w:hAnsi="Times New Roman"/>
+        <w:spacing w:before="280" w:after="120"/>
+        <w:jc w:val="both"/>
+        <w:rPr>
+          <w:rFonts w:ascii="Times New Roman" w:hAnsi="Times New Roman" w:cs="Times New Roman"/>
+          <w:i/>
+          <w:color w:val="FF0000"/>
+          <w:sz w:val="24"/>
+          <w:szCs w:val="24"/>
+        </w:rPr>
+      </w:pPr>
+      <w:r>
+        <w:rPr>
+          <w:rFonts w:ascii="Times New Roman" w:hAnsi="Times New Roman" w:cs="Times New Roman"/>
+          <w:i/>
+          <w:color w:val="FF0000"/>
+          <w:sz w:val="24"/>
+          <w:szCs w:val="24"/>
+        </w:rPr>
+        <w:t xml:space="preserve">(г. 8): </w:t>
+      </w:r>
+      <w:r>
+        <w:rPr>
+          <w:rFonts w:ascii="Times New Roman" w:hAnsi="Times New Roman" w:cs="Times New Roman"/>
+          <w:sz w:val="24"/>
+          <w:szCs w:val="24"/>
+        </w:rPr>
+        <w:t xml:space="preserve">В переполовення празника спраглу душу мою благочестя напій водами, * до всіх бо, Спасе, закликав Ти: * Спраглий нехай гряде до мене і нехай п’є. * Джерело життя нашого, Христе Боже, слава Тобі </w:t>
+      </w:r>
+      <w:r>
+        <w:rPr>
+          <w:rFonts w:ascii="Times New Roman" w:hAnsi="Times New Roman" w:cs="Times New Roman"/>
+          <w:i/>
+          <w:color w:val="FF0000"/>
+          <w:sz w:val="24"/>
+          <w:szCs w:val="24"/>
+        </w:rPr>
+        <w:t>(2 р.).</w:t>
+      </w:r>
+    </w:p>
+    <w:p>
+      <w:pPr>
+        <w:spacing w:before="280" w:after="120"/>
+        <w:jc w:val="both"/>
+        <w:rPr>
+          <w:rFonts w:ascii="Times New Roman" w:hAnsi="Times New Roman" w:cs="Times New Roman"/>
           <w:b/>
           <w:sz w:val="24"/>
-        </w:rPr>
-        <w:t xml:space="preserve">І нині: </w:t>
-      </w:r>
-      <w:r>
-        <w:rPr>
-          <w:rFonts w:ascii="Times New Roman" w:hAnsi="Times New Roman"/>
-          <w:i/>
-          <w:color w:val="FF4400"/>
-          <w:sz w:val="24"/>
-        </w:rPr>
-        <w:t>Тропар (г. 8):</w:t>
-      </w:r>
-      <w:r>
-        <w:rPr>
-          <w:rFonts w:ascii="Times New Roman" w:hAnsi="Times New Roman"/>
-          <w:sz w:val="24"/>
+          <w:szCs w:val="24"/>
+        </w:rPr>
+      </w:pPr>
+      <w:r>
+        <w:rPr>
+          <w:rFonts w:ascii="Times New Roman" w:hAnsi="Times New Roman" w:cs="Times New Roman"/>
+          <w:b/>
+          <w:sz w:val="24"/>
+          <w:szCs w:val="24"/>
+        </w:rPr>
+        <w:t xml:space="preserve">Слава: </w:t>
+      </w:r>
+      <w:r>
+        <w:rPr>
+          <w:rFonts w:ascii="Times New Roman" w:hAnsi="Times New Roman" w:cs="Times New Roman"/>
+          <w:i/>
+          <w:color w:val="FF0000"/>
+          <w:sz w:val="24"/>
+          <w:szCs w:val="24"/>
+        </w:rPr>
+        <w:t>(г. 1):</w:t>
+      </w:r>
+      <w:r>
+        <w:rPr>
+          <w:rFonts w:ascii="Times New Roman" w:hAnsi="Times New Roman" w:cs="Times New Roman"/>
+          <w:sz w:val="24"/>
+          <w:szCs w:val="24"/>
+        </w:rPr>
+        <w:t xml:space="preserve"> Як Христового родича, Симеоне священноначальнику,* і мученика твердого,* який оману погубив і віру зберіг,* священно восхваляємо тебе,* тому днесь священну пам’ять твою святкуючи,* приймаємо за молитвами твоїми прощення гріхів. </w:t>
+      </w:r>
+    </w:p>
+    <w:p>
+      <w:pPr>
+        <w:spacing w:before="280" w:after="120"/>
+        <w:jc w:val="both"/>
+        <w:rPr>
+          <w:rFonts w:ascii="Times New Roman" w:hAnsi="Times New Roman" w:cs="Times New Roman"/>
+          <w:sz w:val="24"/>
+          <w:szCs w:val="24"/>
+        </w:rPr>
+      </w:pPr>
+      <w:r>
+        <w:rPr>
+          <w:rFonts w:ascii="Times New Roman" w:hAnsi="Times New Roman" w:cs="Times New Roman"/>
+          <w:b/>
+          <w:sz w:val="24"/>
+          <w:szCs w:val="24"/>
+        </w:rPr>
+        <w:lastRenderedPageBreak/>
+        <w:t>І нині:</w:t>
+      </w:r>
+      <w:r>
+        <w:rPr>
+          <w:rFonts w:ascii="Times New Roman" w:hAnsi="Times New Roman" w:cs="Times New Roman"/>
+          <w:sz w:val="24"/>
+          <w:szCs w:val="24"/>
         </w:rPr>
         <w:t xml:space="preserve"> </w:t>
       </w:r>
       <w:r>
         <w:rPr>
-          <w:rFonts w:ascii="Times New Roman" w:hAnsi="Times New Roman"/>
-          <w:color w:val="333333"/>
-          <w:sz w:val="24"/>
-        </w:rPr>
-        <w:t>В переполовення празника спраглу душу мою благочестя напій водами,* до всіх бо, Спасе, закликав Ти:* Спраглий нехай гряде до мене і нехай п’є.* Джерело життя нашого, Христе Боже, слава Тобі.</w:t>
-      </w:r>
-    </w:p>
-    <w:p>
-      <w:pPr>
-        <w:pStyle w:val="Normal"/>
+          <w:rFonts w:ascii="Times New Roman" w:hAnsi="Times New Roman" w:cs="Times New Roman"/>
+          <w:i/>
+          <w:color w:val="FF0000"/>
+          <w:sz w:val="24"/>
+          <w:szCs w:val="24"/>
+        </w:rPr>
+        <w:t>(г. 8):</w:t>
+      </w:r>
+      <w:r>
+        <w:rPr>
+          <w:rFonts w:ascii="Times New Roman" w:hAnsi="Times New Roman" w:cs="Times New Roman"/>
+          <w:sz w:val="24"/>
+          <w:szCs w:val="24"/>
+        </w:rPr>
+        <w:t xml:space="preserve"> В переполовення празника спраглу душу мою благочестя напій водами, * до всіх бо, Спасе, закликав Ти: * Спраглий нехай гряде до мене і нехай п’є. * Джерело життя нашого, Христе Боже, слава Тобі.</w:t>
+      </w:r>
+    </w:p>
+    <w:p>
+      <w:pPr>
+        <w:spacing w:after="120"/>
+        <w:jc w:val="both"/>
+        <w:rPr>
+          <w:rFonts w:ascii="Times New Roman" w:hAnsi="Times New Roman" w:cs="Times New Roman"/>
+          <w:color w:val="FF0000"/>
+          <w:sz w:val="24"/>
+          <w:szCs w:val="24"/>
+        </w:rPr>
       </w:pPr>
     </w:p>
     <w:p>
@@ -10573,19 +10598,21 @@
       </w:pPr>
       <w:r>
         <w:rPr>
-          <w:rFonts w:ascii="Times New Roman" w:hAnsi="Times New Roman"/>
+          <w:rFonts w:ascii="Times New Roman" w:hAnsi="Times New Roman" w:cs="Times New Roman"/>
           <w:i/>
           <w:color w:val="FF4400"/>
           <w:sz w:val="24"/>
+          <w:szCs w:val="24"/>
         </w:rPr>
         <w:t>Священик:</w:t>
       </w:r>
       <w:r>
         <w:rPr>
-          <w:rFonts w:ascii="Times New Roman" w:hAnsi="Times New Roman"/>
-          <w:sz w:val="24"/>
-        </w:rPr>
-        <w:t xml:space="preserve"> Бо Твоя влада і Твоє єсть царство і сила, і слава Отця, і Сина, і Святого Духа, нині і повсякчас, і на віки віків.</w:t>
+          <w:rFonts w:ascii="Times New Roman" w:hAnsi="Times New Roman" w:cs="Times New Roman"/>
+          <w:sz w:val="24"/>
+          <w:szCs w:val="24"/>
+        </w:rPr>
+        <w:t> Бо Твоя влада і Твоє єсть царство і сила, і слава Отця, і Сина, і Святого Духа, нині і повсякчас, і на віки віків.</w:t>
       </w:r>
     </w:p>
     <w:p>
@@ -10967,19 +10994,21 @@
       </w:pPr>
       <w:r>
         <w:rPr>
-          <w:rFonts w:ascii="Times New Roman" w:hAnsi="Times New Roman"/>
+          <w:rFonts w:ascii="Times New Roman" w:hAnsi="Times New Roman" w:cs="Times New Roman"/>
           <w:i/>
           <w:color w:val="FF4400"/>
           <w:sz w:val="24"/>
+          <w:szCs w:val="24"/>
         </w:rPr>
         <w:t>Священик:</w:t>
       </w:r>
       <w:r>
         <w:rPr>
-          <w:rFonts w:ascii="Times New Roman" w:hAnsi="Times New Roman"/>
-          <w:sz w:val="24"/>
-        </w:rPr>
-        <w:t xml:space="preserve"> Бо Ти благий і Чоловіколюбець Бог єси і Тобі славу возсилаємо Отцю, і Сину, і Святому Духові, нині і повсякчас, і на віки віків.</w:t>
+          <w:rFonts w:ascii="Times New Roman" w:hAnsi="Times New Roman" w:cs="Times New Roman"/>
+          <w:sz w:val="24"/>
+          <w:szCs w:val="24"/>
+        </w:rPr>
+        <w:t> Бо Ти благий і Чоловіколюбець Бог єси і Тобі славу возсилаємо Отцю, і Сину, і Святому Духові, нині і повсякчас, і на віки віків.</w:t>
       </w:r>
     </w:p>
     <w:p>
@@ -12258,19 +12287,21 @@
       </w:pPr>
       <w:r>
         <w:rPr>
-          <w:rFonts w:ascii="Times New Roman" w:hAnsi="Times New Roman"/>
-          <w:i/>
-          <w:color w:val="FF4400"/>
-          <w:sz w:val="24"/>
-        </w:rPr>
-        <w:t>Священик:</w:t>
-      </w:r>
-      <w:r>
-        <w:rPr>
-          <w:rFonts w:ascii="Times New Roman" w:hAnsi="Times New Roman"/>
-          <w:sz w:val="24"/>
-        </w:rPr>
-        <w:t xml:space="preserve"> Бо Ти Бог наш і Тобі славу возсилаємо: Отцю, і Сину, і Святому Духові, нині і повсякчас, і на віки віків.</w:t>
+          <w:rFonts w:ascii="Times New Roman" w:hAnsi="Times New Roman" w:cs="Times New Roman"/>
+          <w:i/>
+          <w:color w:val="FF0000"/>
+          <w:sz w:val="24"/>
+          <w:szCs w:val="24"/>
+        </w:rPr>
+        <w:t xml:space="preserve">Священик: </w:t>
+      </w:r>
+      <w:r>
+        <w:rPr>
+          <w:rFonts w:ascii="Times New Roman" w:hAnsi="Times New Roman" w:cs="Times New Roman"/>
+          <w:sz w:val="24"/>
+          <w:szCs w:val="24"/>
+        </w:rPr>
+        <w:t>Бо Ти Бог наш і Тобі славу возсилаємо: Отцю, і Сину, і Святому Духові, нині і повсякчас, і на віки віків.</w:t>
       </w:r>
     </w:p>
     <w:p>
@@ -13098,19 +13129,21 @@
       </w:pPr>
       <w:r>
         <w:rPr>
-          <w:rFonts w:ascii="Times New Roman" w:hAnsi="Times New Roman"/>
-          <w:i/>
-          <w:color w:val="FF4400"/>
-          <w:sz w:val="24"/>
-        </w:rPr>
-        <w:t>Священик:</w:t>
-      </w:r>
-      <w:r>
-        <w:rPr>
-          <w:rFonts w:ascii="Times New Roman" w:hAnsi="Times New Roman"/>
-          <w:sz w:val="24"/>
-        </w:rPr>
-        <w:t xml:space="preserve"> Бо Ти цар миру і Спас душ наших і Тобі славу возсилаємо: Отцю, і Сину, і Святому Духові, нині і повсякчас, і на віки віків.</w:t>
+          <w:rFonts w:ascii="Times New Roman" w:hAnsi="Times New Roman" w:cs="Times New Roman"/>
+          <w:i/>
+          <w:color w:val="FF0000"/>
+          <w:sz w:val="24"/>
+          <w:szCs w:val="24"/>
+        </w:rPr>
+        <w:t xml:space="preserve">Священик: </w:t>
+      </w:r>
+      <w:r>
+        <w:rPr>
+          <w:rFonts w:ascii="Times New Roman" w:hAnsi="Times New Roman" w:cs="Times New Roman"/>
+          <w:sz w:val="24"/>
+          <w:szCs w:val="24"/>
+        </w:rPr>
+        <w:t>Бо Ти цар миру і Спас душ наших і Тобі славу возсилаємо: Отцю, і Сину, і Святому Духові, нині і повсякчас, і на віки віків.</w:t>
       </w:r>
     </w:p>
     <w:p>
@@ -14254,19 +14287,21 @@
       </w:pPr>
       <w:r>
         <w:rPr>
-          <w:rFonts w:ascii="Times New Roman" w:hAnsi="Times New Roman"/>
-          <w:i/>
-          <w:color w:val="FF4400"/>
-          <w:sz w:val="24"/>
-        </w:rPr>
-        <w:t>Священик:</w:t>
-      </w:r>
-      <w:r>
-        <w:rPr>
-          <w:rFonts w:ascii="Times New Roman" w:hAnsi="Times New Roman"/>
-          <w:sz w:val="24"/>
-        </w:rPr>
-        <w:t xml:space="preserve"> Бо Тебе хвалять усі сили небесні і Тобі славу возсилаємо: Отцю, і Сину, і Святому Духові, нині і повсякчас, і на віки віків.</w:t>
+          <w:rFonts w:ascii="Times New Roman" w:hAnsi="Times New Roman" w:cs="Times New Roman"/>
+          <w:i/>
+          <w:color w:val="FF0000"/>
+          <w:sz w:val="24"/>
+          <w:szCs w:val="24"/>
+        </w:rPr>
+        <w:t xml:space="preserve">Священик: </w:t>
+      </w:r>
+      <w:r>
+        <w:rPr>
+          <w:rFonts w:ascii="Times New Roman" w:hAnsi="Times New Roman" w:cs="Times New Roman"/>
+          <w:sz w:val="24"/>
+          <w:szCs w:val="24"/>
+        </w:rPr>
+        <w:t>Бо Тебе хвалять усі сили небесні і Тобі славу возсилаємо: Отцю, і Сину, і Святому Духові, нині і повсякчас, і на віки віків.</w:t>
       </w:r>
     </w:p>
     <w:p>
@@ -15107,17 +15142,19 @@
       </w:pPr>
       <w:r>
         <w:rPr>
-          <w:rFonts w:ascii="Times New Roman" w:hAnsi="Times New Roman"/>
+          <w:rFonts w:ascii="Times New Roman" w:hAnsi="Times New Roman" w:cs="Times New Roman"/>
           <w:i/>
           <w:color w:val="FF4400"/>
           <w:sz w:val="24"/>
+          <w:szCs w:val="24"/>
         </w:rPr>
         <w:t>Священик:</w:t>
       </w:r>
       <w:r>
         <w:rPr>
-          <w:rFonts w:ascii="Times New Roman" w:hAnsi="Times New Roman"/>
-          <w:sz w:val="24"/>
+          <w:rFonts w:ascii="Times New Roman" w:hAnsi="Times New Roman" w:cs="Times New Roman"/>
+          <w:sz w:val="24"/>
+          <w:szCs w:val="24"/>
         </w:rPr>
         <w:t xml:space="preserve"> Слава тобі, що Світло нам показав!</w:t>
       </w:r>
@@ -16141,17 +16178,19 @@
       </w:pPr>
       <w:r>
         <w:rPr>
-          <w:rFonts w:ascii="Times New Roman" w:hAnsi="Times New Roman"/>
+          <w:rFonts w:ascii="Times New Roman" w:hAnsi="Times New Roman" w:cs="Times New Roman"/>
           <w:i/>
           <w:color w:val="FF4400"/>
           <w:sz w:val="24"/>
+          <w:szCs w:val="24"/>
         </w:rPr>
         <w:t>Священик:</w:t>
       </w:r>
       <w:r>
         <w:rPr>
-          <w:rFonts w:ascii="Times New Roman" w:hAnsi="Times New Roman"/>
-          <w:sz w:val="24"/>
+          <w:rFonts w:ascii="Times New Roman" w:hAnsi="Times New Roman" w:cs="Times New Roman"/>
+          <w:sz w:val="24"/>
+          <w:szCs w:val="24"/>
         </w:rPr>
         <w:t xml:space="preserve"> Бо ти Бог милости, ласк і чоловіколюбности, і тобі славу віддаємо: Отцю, і Сину, і Святому Духові, нині і повсякчас, і на віки віків.</w:t>
       </w:r>
@@ -16206,17 +16245,19 @@
       </w:pPr>
       <w:r>
         <w:rPr>
-          <w:rFonts w:ascii="Times New Roman" w:hAnsi="Times New Roman"/>
+          <w:rFonts w:ascii="Times New Roman" w:hAnsi="Times New Roman" w:cs="Times New Roman"/>
           <w:i/>
           <w:color w:val="FF4400"/>
           <w:sz w:val="24"/>
+          <w:szCs w:val="24"/>
         </w:rPr>
         <w:t>Священик:</w:t>
       </w:r>
       <w:r>
         <w:rPr>
-          <w:rFonts w:ascii="Times New Roman" w:hAnsi="Times New Roman"/>
-          <w:sz w:val="24"/>
+          <w:rFonts w:ascii="Times New Roman" w:hAnsi="Times New Roman" w:cs="Times New Roman"/>
+          <w:sz w:val="24"/>
+          <w:szCs w:val="24"/>
         </w:rPr>
         <w:t xml:space="preserve"> Мир всім.</w:t>
       </w:r>
@@ -16924,17 +16965,19 @@
       </w:pPr>
       <w:r>
         <w:rPr>
-          <w:rFonts w:ascii="Times New Roman" w:hAnsi="Times New Roman"/>
+          <w:rFonts w:ascii="Times New Roman" w:hAnsi="Times New Roman" w:cs="Times New Roman"/>
           <w:i/>
           <w:color w:val="FF4400"/>
           <w:sz w:val="24"/>
+          <w:szCs w:val="24"/>
         </w:rPr>
         <w:t>Священик:</w:t>
       </w:r>
       <w:r>
         <w:rPr>
-          <w:rFonts w:ascii="Times New Roman" w:hAnsi="Times New Roman"/>
-          <w:sz w:val="24"/>
+          <w:rFonts w:ascii="Times New Roman" w:hAnsi="Times New Roman" w:cs="Times New Roman"/>
+          <w:sz w:val="24"/>
+          <w:szCs w:val="24"/>
         </w:rPr>
         <w:t xml:space="preserve"> Бо твоє є царство, і сила, і слава, Отця, і Сина, і Святого Духа, нині і повсякчас, і на віки віків.</w:t>
       </w:r>
@@ -17023,84 +17066,83 @@
     </w:p>
     <w:p>
       <w:pPr>
-        <w:pStyle w:val="a"/>
-        <w:spacing w:after="160"/>
-      </w:pPr>
-      <w:r>
-        <w:rPr>
-          <w:rFonts w:ascii="Times New Roman" w:hAnsi="Times New Roman"/>
-          <w:i/>
-          <w:color w:val="FF0000"/>
-          <w:sz w:val="24"/>
-        </w:rPr>
-        <w:t>Тропар (г. 4):</w:t>
-      </w:r>
-      <w:r>
-        <w:rPr>
-          <w:rFonts w:ascii="Times New Roman" w:hAnsi="Times New Roman"/>
-          <w:color w:val="000000"/>
-          <w:sz w:val="24"/>
-        </w:rPr>
-        <w:t xml:space="preserve"> Мученики Твої, Господи* у </w:t>
-      </w:r>
-      <w:r>
-        <w:rPr>
-          <w:rFonts w:ascii="Times New Roman" w:hAnsi="Times New Roman"/>
-          <w:sz w:val="24"/>
-        </w:rPr>
-        <w:t>стражданнях</w:t>
-      </w:r>
-      <w:r>
-        <w:rPr>
-          <w:rFonts w:ascii="Times New Roman" w:hAnsi="Times New Roman"/>
-          <w:color w:val="000000"/>
-          <w:sz w:val="24"/>
-        </w:rPr>
-        <w:t xml:space="preserve"> своїх прийняли вінець нетлінний від Тебе, Бога нашого,* мавши бо кріпость Твою, вони мучителів подолали,* сокрушили і демонів зухвальства безсильні.* Їх молитвами спаси душі наші.</w:t>
-      </w:r>
-    </w:p>
-    <w:p>
-      <w:pPr>
-        <w:pStyle w:val="Normal"/>
-      </w:pPr>
-      <w:r>
-        <w:rPr>
-          <w:rFonts w:ascii="Times New Roman" w:hAnsi="Times New Roman"/>
+        <w:spacing w:before="280" w:after="120"/>
+        <w:jc w:val="both"/>
+        <w:rPr>
+          <w:rFonts w:ascii="Times New Roman" w:hAnsi="Times New Roman" w:cs="Times New Roman"/>
           <w:b/>
           <w:sz w:val="24"/>
-        </w:rPr>
-        <w:t xml:space="preserve">І нині: </w:t>
-      </w:r>
-      <w:r>
-        <w:rPr>
-          <w:rFonts w:ascii="Times New Roman" w:hAnsi="Times New Roman"/>
-          <w:i/>
-          <w:color w:val="FF4400"/>
-          <w:sz w:val="24"/>
-        </w:rPr>
-        <w:t>Тропар (г. 8):</w:t>
-      </w:r>
-      <w:r>
-        <w:rPr>
-          <w:rFonts w:ascii="Times New Roman" w:hAnsi="Times New Roman"/>
-          <w:sz w:val="24"/>
+          <w:szCs w:val="24"/>
+        </w:rPr>
+      </w:pPr>
+      <w:r>
+        <w:rPr>
+          <w:rFonts w:ascii="Times New Roman" w:hAnsi="Times New Roman" w:cs="Times New Roman"/>
+          <w:i/>
+          <w:color w:val="FF0000"/>
+          <w:sz w:val="24"/>
+          <w:szCs w:val="24"/>
+        </w:rPr>
+        <w:t>(г. 1):</w:t>
+      </w:r>
+      <w:r>
+        <w:rPr>
+          <w:rFonts w:ascii="Times New Roman" w:hAnsi="Times New Roman" w:cs="Times New Roman"/>
+          <w:sz w:val="24"/>
+          <w:szCs w:val="24"/>
+        </w:rPr>
+        <w:t xml:space="preserve"> Як Христового родича, Симеоне священноначальнику,* і мученика твердого,* який оману погубив і віру зберіг,* священно восхваляємо тебе,* тому днесь священну пам’ять твою святкуючи,* приймаємо за молитвами твоїми прощення гріхів. </w:t>
+      </w:r>
+    </w:p>
+    <w:p>
+      <w:pPr>
+        <w:spacing w:before="280" w:after="120"/>
+        <w:jc w:val="both"/>
+        <w:rPr>
+          <w:rFonts w:ascii="Times New Roman" w:hAnsi="Times New Roman" w:cs="Times New Roman"/>
+          <w:i/>
+          <w:color w:val="FF0000"/>
+          <w:sz w:val="24"/>
+          <w:szCs w:val="24"/>
+        </w:rPr>
+      </w:pPr>
+      <w:r>
+        <w:rPr>
+          <w:rFonts w:ascii="Times New Roman" w:hAnsi="Times New Roman" w:cs="Times New Roman"/>
+          <w:b/>
+          <w:sz w:val="24"/>
+          <w:szCs w:val="24"/>
+        </w:rPr>
+        <w:t>Слава І нині:</w:t>
+      </w:r>
+      <w:r>
+        <w:rPr>
+          <w:rFonts w:ascii="Times New Roman" w:hAnsi="Times New Roman" w:cs="Times New Roman"/>
+          <w:sz w:val="24"/>
+          <w:szCs w:val="24"/>
         </w:rPr>
         <w:t xml:space="preserve"> </w:t>
       </w:r>
       <w:r>
         <w:rPr>
-          <w:rFonts w:ascii="Times New Roman" w:hAnsi="Times New Roman"/>
-          <w:color w:val="333333"/>
-          <w:sz w:val="24"/>
-        </w:rPr>
-        <w:t>В переполовення празника спраглу душу мою благочестя напій водами,* до всіх бо, Спасе, закликав Ти:* Спраглий нехай гряде до мене і нехай п’є.* Джерело життя нашого, Христе Боже, слава Тобі.</w:t>
-      </w:r>
-    </w:p>
-    <w:p>
-      <w:pPr>
-        <w:pStyle w:val="Normal"/>
-      </w:pPr>
-    </w:p>
+          <w:rFonts w:ascii="Times New Roman" w:hAnsi="Times New Roman" w:cs="Times New Roman"/>
+          <w:i/>
+          <w:color w:val="FF0000"/>
+          <w:sz w:val="24"/>
+          <w:szCs w:val="24"/>
+        </w:rPr>
+        <w:t>(г. 8):</w:t>
+      </w:r>
+      <w:r>
+        <w:rPr>
+          <w:rFonts w:ascii="Times New Roman" w:hAnsi="Times New Roman" w:cs="Times New Roman"/>
+          <w:sz w:val="24"/>
+          <w:szCs w:val="24"/>
+        </w:rPr>
+        <w:t xml:space="preserve"> В переполовення празника спраглу душу мою благочестя напій водами, * до всіх бо, Спасе, закликав Ти: * Спраглий нехай гряде до мене і нехай п’є. * Джерело життя нашого, Христе Боже, слава Тобі.</w:t>
+      </w:r>
+    </w:p>
+    <w:p/>
     <w:p>
       <w:pPr>
         <w:pStyle w:val="Heading3"/>
@@ -17484,17 +17526,19 @@
       </w:pPr>
       <w:r>
         <w:rPr>
-          <w:rFonts w:ascii="Times New Roman" w:hAnsi="Times New Roman"/>
+          <w:rFonts w:ascii="Times New Roman" w:hAnsi="Times New Roman" w:cs="Times New Roman"/>
           <w:i/>
           <w:color w:val="FF4400"/>
           <w:sz w:val="24"/>
+          <w:szCs w:val="24"/>
         </w:rPr>
         <w:t>Священик:</w:t>
       </w:r>
       <w:r>
         <w:rPr>
-          <w:rFonts w:ascii="Times New Roman" w:hAnsi="Times New Roman"/>
-          <w:sz w:val="24"/>
+          <w:rFonts w:ascii="Times New Roman" w:hAnsi="Times New Roman" w:cs="Times New Roman"/>
+          <w:sz w:val="24"/>
+          <w:szCs w:val="24"/>
         </w:rPr>
         <w:t xml:space="preserve"> Бо милостивий і чоловіколюбець Бог єси, і тобі славу возсилаємо, Отцю, і Сину, і Святому Духові, нині і повсякчас, і на віки віків.</w:t>
       </w:r>
@@ -17657,143 +17701,167 @@
       </w:pPr>
       <w:r>
         <w:rPr>
-          <w:rFonts w:ascii="Times New Roman" w:hAnsi="Times New Roman"/>
+          <w:rFonts w:ascii="Times New Roman" w:hAnsi="Times New Roman" w:cs="Times New Roman"/>
+          <w:i/>
+          <w:color w:val="FF0000"/>
+          <w:sz w:val="24"/>
+          <w:szCs w:val="24"/>
+        </w:rPr>
+        <w:t>Священик:</w:t>
+      </w:r>
+      <w:r>
+        <w:rPr>
+          <w:rFonts w:ascii="Times New Roman" w:hAnsi="Times New Roman" w:cs="Times New Roman"/>
+          <w:color w:val="FF0000"/>
+          <w:sz w:val="24"/>
+          <w:szCs w:val="24"/>
+        </w:rPr>
+        <w:t xml:space="preserve"> </w:t>
+      </w:r>
+      <w:r>
+        <w:rPr>
+          <w:rFonts w:ascii="Times New Roman" w:hAnsi="Times New Roman" w:cs="Times New Roman"/>
+          <w:sz w:val="24"/>
+          <w:szCs w:val="24"/>
+        </w:rPr>
+        <w:t>Благословенний Христос, Бог наш, завжди, нині і повсякчас, і на віки віків.</w:t>
+      </w:r>
+    </w:p>
+    <w:p>
+      <w:pPr>
+        <w:spacing w:before="280" w:after="120"/>
+        <w:jc w:val="both"/>
+        <w:rPr>
+          <w:rFonts w:ascii="Times New Roman" w:hAnsi="Times New Roman" w:cs="Times New Roman"/>
+          <w:sz w:val="24"/>
+          <w:szCs w:val="24"/>
+        </w:rPr>
+      </w:pPr>
+      <w:r>
+        <w:rPr>
+          <w:rFonts w:ascii="Times New Roman" w:hAnsi="Times New Roman" w:cs="Times New Roman"/>
+          <w:i/>
+          <w:color w:val="FF0000"/>
+          <w:sz w:val="24"/>
+          <w:szCs w:val="24"/>
+        </w:rPr>
+        <w:t>Вірні:</w:t>
+      </w:r>
+      <w:r>
+        <w:rPr>
+          <w:rFonts w:ascii="Times New Roman" w:hAnsi="Times New Roman" w:cs="Times New Roman"/>
+          <w:color w:val="FF0000"/>
+          <w:sz w:val="24"/>
+          <w:szCs w:val="24"/>
+        </w:rPr>
+        <w:t xml:space="preserve"> </w:t>
+      </w:r>
+      <w:r>
+        <w:rPr>
+          <w:rFonts w:ascii="Times New Roman" w:hAnsi="Times New Roman" w:cs="Times New Roman"/>
+          <w:sz w:val="24"/>
+          <w:szCs w:val="24"/>
+        </w:rPr>
+        <w:t>Амінь. Утверди, Боже, святу православну віру на віки віків.</w:t>
+      </w:r>
+    </w:p>
+    <w:p>
+      <w:pPr>
+        <w:spacing w:before="280" w:after="120"/>
+        <w:jc w:val="both"/>
+        <w:rPr>
+          <w:rFonts w:ascii="Times New Roman" w:hAnsi="Times New Roman" w:cs="Times New Roman"/>
+          <w:sz w:val="24"/>
+          <w:szCs w:val="24"/>
+        </w:rPr>
+      </w:pPr>
+      <w:r>
+        <w:rPr>
+          <w:rFonts w:ascii="Times New Roman" w:hAnsi="Times New Roman" w:cs="Times New Roman"/>
+          <w:i/>
+          <w:color w:val="FF0000"/>
+          <w:sz w:val="24"/>
+          <w:szCs w:val="24"/>
+        </w:rPr>
+        <w:t>Священик:</w:t>
+      </w:r>
+      <w:r>
+        <w:rPr>
+          <w:rFonts w:ascii="Times New Roman" w:hAnsi="Times New Roman" w:cs="Times New Roman"/>
+          <w:color w:val="FF0000"/>
+          <w:sz w:val="24"/>
+          <w:szCs w:val="24"/>
+        </w:rPr>
+        <w:t xml:space="preserve"> </w:t>
+      </w:r>
+      <w:r>
+        <w:rPr>
+          <w:rFonts w:ascii="Times New Roman" w:hAnsi="Times New Roman" w:cs="Times New Roman"/>
+          <w:sz w:val="24"/>
+          <w:szCs w:val="24"/>
+        </w:rPr>
+        <w:t>Пресвята Богородице, спаси нас.</w:t>
+      </w:r>
+    </w:p>
+    <w:p>
+      <w:pPr>
+        <w:spacing w:after="120"/>
+        <w:jc w:val="both"/>
+        <w:rPr>
+          <w:rFonts w:ascii="Times New Roman" w:hAnsi="Times New Roman" w:cs="Times New Roman"/>
+          <w:color w:val="000000"/>
+          <w:sz w:val="24"/>
+          <w:szCs w:val="24"/>
+        </w:rPr>
+      </w:pPr>
+      <w:r>
+        <w:rPr>
+          <w:rFonts w:ascii="Times New Roman" w:hAnsi="Times New Roman" w:cs="Times New Roman"/>
+          <w:i/>
+          <w:color w:val="FF0000"/>
+          <w:sz w:val="24"/>
+          <w:szCs w:val="24"/>
+        </w:rPr>
+        <w:t>Вірні:</w:t>
+      </w:r>
+      <w:r>
+        <w:rPr>
+          <w:rFonts w:ascii="Times New Roman" w:hAnsi="Times New Roman" w:cs="Times New Roman"/>
+          <w:color w:val="000000"/>
+          <w:sz w:val="24"/>
+          <w:szCs w:val="24"/>
+        </w:rPr>
+        <w:t> Світися, світися, новий Єрусалиме!* Слава бо Господня на тобі засяяла!* Радій нині й веселися, Сіоне,* а ти, чиста Богородице, втішайся воскресінням Сина твого!</w:t>
+      </w:r>
+    </w:p>
+    <w:p>
+      <w:pPr>
+        <w:spacing w:after="120"/>
+        <w:jc w:val="both"/>
+        <w:rPr>
+          <w:rFonts w:ascii="Times New Roman" w:hAnsi="Times New Roman" w:cs="Times New Roman"/>
+          <w:color w:val="000000"/>
+          <w:sz w:val="24"/>
+          <w:szCs w:val="24"/>
+        </w:rPr>
+      </w:pPr>
+      <w:r>
+        <w:rPr>
+          <w:rFonts w:ascii="Times New Roman" w:hAnsi="Times New Roman" w:cs="Times New Roman"/>
           <w:i/>
           <w:color w:val="FF4400"/>
           <w:sz w:val="24"/>
+          <w:szCs w:val="24"/>
         </w:rPr>
         <w:t>Священик:</w:t>
       </w:r>
       <w:r>
         <w:rPr>
-          <w:rFonts w:ascii="Times New Roman" w:hAnsi="Times New Roman"/>
-          <w:sz w:val="24"/>
-        </w:rPr>
-        <w:t xml:space="preserve"> Благословенний Христос, Бог наш, завжди, нині і повсякчас, і на віки віків.</w:t>
-      </w:r>
-    </w:p>
-    <w:p>
-      <w:pPr>
-        <w:spacing w:before="280" w:after="120"/>
-        <w:jc w:val="both"/>
-        <w:rPr>
-          <w:rFonts w:ascii="Times New Roman" w:hAnsi="Times New Roman" w:cs="Times New Roman"/>
-          <w:sz w:val="24"/>
-          <w:szCs w:val="24"/>
-        </w:rPr>
-      </w:pPr>
-      <w:r>
-        <w:rPr>
-          <w:rFonts w:ascii="Times New Roman" w:hAnsi="Times New Roman" w:cs="Times New Roman"/>
-          <w:i/>
-          <w:color w:val="FF0000"/>
-          <w:sz w:val="24"/>
-          <w:szCs w:val="24"/>
-        </w:rPr>
-        <w:t>Вірні:</w:t>
-      </w:r>
-      <w:r>
-        <w:rPr>
-          <w:rFonts w:ascii="Times New Roman" w:hAnsi="Times New Roman" w:cs="Times New Roman"/>
-          <w:color w:val="FF0000"/>
-          <w:sz w:val="24"/>
-          <w:szCs w:val="24"/>
-        </w:rPr>
-        <w:t xml:space="preserve"> </w:t>
-      </w:r>
-      <w:r>
-        <w:rPr>
-          <w:rFonts w:ascii="Times New Roman" w:hAnsi="Times New Roman" w:cs="Times New Roman"/>
-          <w:sz w:val="24"/>
-          <w:szCs w:val="24"/>
-        </w:rPr>
-        <w:t>Амінь. Утверди, Боже, святу православну віру на віки віків.</w:t>
-      </w:r>
-    </w:p>
-    <w:p>
-      <w:pPr>
-        <w:spacing w:before="280" w:after="120"/>
-        <w:jc w:val="both"/>
-        <w:rPr>
-          <w:rFonts w:ascii="Times New Roman" w:hAnsi="Times New Roman" w:cs="Times New Roman"/>
-          <w:sz w:val="24"/>
-          <w:szCs w:val="24"/>
-        </w:rPr>
-      </w:pPr>
-      <w:r>
-        <w:rPr>
-          <w:rFonts w:ascii="Times New Roman" w:hAnsi="Times New Roman"/>
-          <w:i/>
-          <w:color w:val="FF4400"/>
-          <w:sz w:val="24"/>
-        </w:rPr>
-        <w:t>Священик:</w:t>
-      </w:r>
-      <w:r>
-        <w:rPr>
-          <w:rFonts w:ascii="Times New Roman" w:hAnsi="Times New Roman"/>
-          <w:sz w:val="24"/>
-        </w:rPr>
-        <w:t xml:space="preserve"> Пресвята Богородице, спаси нас.</w:t>
-      </w:r>
-    </w:p>
-    <w:p>
-      <w:pPr>
-        <w:spacing w:after="120"/>
-        <w:jc w:val="both"/>
-        <w:rPr>
-          <w:rFonts w:ascii="Times New Roman" w:hAnsi="Times New Roman" w:cs="Times New Roman"/>
-          <w:color w:val="000000"/>
-          <w:sz w:val="24"/>
-          <w:szCs w:val="24"/>
-        </w:rPr>
-      </w:pPr>
-      <w:r>
-        <w:rPr>
-          <w:rFonts w:ascii="Times New Roman" w:hAnsi="Times New Roman" w:cs="Times New Roman"/>
-          <w:i/>
-          <w:color w:val="FF0000"/>
-          <w:sz w:val="24"/>
-          <w:szCs w:val="24"/>
-        </w:rPr>
-        <w:t>Вірні:</w:t>
-      </w:r>
-      <w:r>
-        <w:rPr>
-          <w:rFonts w:ascii="Times New Roman" w:hAnsi="Times New Roman" w:cs="Times New Roman"/>
-          <w:color w:val="000000"/>
-          <w:sz w:val="24"/>
-          <w:szCs w:val="24"/>
-        </w:rPr>
-        <w:t> Світися, світися, новий Єрусалиме!* Слава бо Господня на тобі засяяла!* Радій нині й веселися, Сіоне,* а ти, чиста Богородице, втішайся воскресінням Сина твого!</w:t>
-      </w:r>
-    </w:p>
-    <w:p>
-      <w:pPr>
-        <w:spacing w:after="120"/>
-        <w:jc w:val="both"/>
-        <w:rPr>
-          <w:rFonts w:ascii="Times New Roman" w:hAnsi="Times New Roman" w:cs="Times New Roman"/>
-          <w:color w:val="000000"/>
-          <w:sz w:val="24"/>
-          <w:szCs w:val="24"/>
-        </w:rPr>
-      </w:pPr>
-      <w:r>
-        <w:rPr>
-          <w:rFonts w:ascii="Times New Roman" w:hAnsi="Times New Roman"/>
-          <w:i/>
-          <w:color w:val="FF4400"/>
-          <w:sz w:val="24"/>
-        </w:rPr>
-        <w:t>Священик:</w:t>
-      </w:r>
-      <w:r>
-        <w:rPr>
-          <w:rFonts w:ascii="Times New Roman" w:hAnsi="Times New Roman"/>
-          <w:sz w:val="24"/>
-        </w:rPr>
-        <w:t xml:space="preserve"> Слава тобі, Христе Боже, надіє наша, слава тобі!</w:t>
+          <w:rFonts w:ascii="Times New Roman" w:hAnsi="Times New Roman" w:cs="Times New Roman"/>
+          <w:sz w:val="24"/>
+          <w:szCs w:val="24"/>
+        </w:rPr>
+        <w:t> Слава тобі, Христе Боже, надіє наша, слава тобі!</w:t>
       </w:r>
     </w:p>
     <w:p>
@@ -17848,37 +17916,61 @@
       </w:r>
     </w:p>
     <w:p>
-      <w:r>
-        <w:rPr>
-          <w:rFonts w:ascii="Times New Roman" w:hAnsi="Times New Roman"/>
-          <w:i/>
-          <w:color w:val="FF4400"/>
-          <w:sz w:val="24"/>
+      <w:pPr>
+        <w:spacing w:before="280" w:after="120"/>
+        <w:jc w:val="both"/>
+        <w:rPr>
+          <w:rFonts w:ascii="Times New Roman" w:hAnsi="Times New Roman" w:cs="Times New Roman"/>
+          <w:i/>
+          <w:color w:val="FF0000"/>
+          <w:sz w:val="24"/>
+          <w:szCs w:val="24"/>
+        </w:rPr>
+      </w:pPr>
+      <w:r>
+        <w:rPr>
+          <w:rFonts w:ascii="Times New Roman" w:hAnsi="Times New Roman" w:cs="Times New Roman"/>
+          <w:i/>
+          <w:color w:val="FF0000"/>
+          <w:sz w:val="24"/>
+          <w:szCs w:val="24"/>
         </w:rPr>
         <w:t>Священик:</w:t>
       </w:r>
       <w:r>
         <w:rPr>
-          <w:rFonts w:ascii="Times New Roman" w:hAnsi="Times New Roman"/>
-          <w:sz w:val="24"/>
-        </w:rPr>
-        <w:t xml:space="preserve"> Христос, істинний Бог наш - молитвами пречистої Своєї Матері, силою чесного і животворчого Хреста, заступництвом чесних небесних сил безтілесних, чесного і славного пророка, предтечі і хрестителя Йоана, святих славних і всехвальних апостолів, святого отця нашого Миколая, архиєпископа Мир Ликійських, чудотворця, святих славних і переможних мучеників, преподобних і богоносних отців наших, святих і праведних богоотців Йоакима й Анни, святого, </w:t>
-      </w:r>
-      <w:r>
-        <w:rPr>
-          <w:rFonts w:ascii="Times New Roman" w:hAnsi="Times New Roman"/>
-          <w:i/>
-          <w:color w:val="FF4400"/>
-          <w:sz w:val="24"/>
-        </w:rPr>
-        <w:t>якого є храм</w:t>
-      </w:r>
-      <w:r>
-        <w:rPr>
-          <w:rFonts w:ascii="Times New Roman" w:hAnsi="Times New Roman"/>
-          <w:sz w:val="24"/>
-        </w:rPr>
-        <w:t>, святого мученика Юстина, філософа, і тих, що з ним і всіх святих - помилує і спасе нас як благий і людинолюбний.</w:t>
+          <w:rFonts w:ascii="Times New Roman" w:hAnsi="Times New Roman" w:cs="Times New Roman"/>
+          <w:color w:val="FF0000"/>
+          <w:sz w:val="24"/>
+          <w:szCs w:val="24"/>
+        </w:rPr>
+        <w:t xml:space="preserve"> </w:t>
+      </w:r>
+      <w:r>
+        <w:rPr>
+          <w:rFonts w:ascii="Times New Roman" w:hAnsi="Times New Roman" w:cs="Times New Roman"/>
+          <w:sz w:val="24"/>
+          <w:szCs w:val="24"/>
+        </w:rPr>
+        <w:t xml:space="preserve">Христос, що воскрес із мертвих, істинний Бог наш, молитвами пречистої своєї Матері, святих, славних і всехвальних апостолів. і святого </w:t>
+      </w:r>
+      <w:r>
+        <w:rPr>
+          <w:rFonts w:ascii="Times New Roman" w:hAnsi="Times New Roman" w:cs="Times New Roman"/>
+          <w:i/>
+          <w:color w:val="FF0000"/>
+          <w:sz w:val="24"/>
+          <w:szCs w:val="24"/>
+        </w:rPr>
+        <w:t>(ім'я, якого є храм)</w:t>
+      </w:r>
+      <w:r>
+        <w:rPr>
+          <w:rFonts w:ascii="Times New Roman" w:hAnsi="Times New Roman" w:cs="Times New Roman"/>
+          <w:sz w:val="24"/>
+          <w:szCs w:val="24"/>
+        </w:rPr>
+        <w:t>, святого священномученика Симеона, родича Господнього, преподобного Стефана, єпископа Володимира Волинського, і всіх святих, помилує і спасе нас, як благий і чоловіколюбець.</w:t>
       </w:r>
     </w:p>
     <w:p>

</xml_diff>